<commit_message>
fix: remove hardcoded demo order from KDS and resolve order disappearance sync bug
</commit_message>
<xml_diff>
--- a/FOODWOK_Project_Report.docx
+++ b/FOODWOK_Project_Report.docx
@@ -29,7 +29,7 @@
           <w:color w:val="1E293B"/>
           <w:sz w:val="22"/>
         </w:rPr>
-        <w:t>Comprehensive Summary of Platform Development, Unified Auth Architecture Migration, Implemented Operational Policies, and Quality Verification Checks</w:t>
+        <w:t>Comprehensive Summary of Codebase Architecture, Real-Time Supabase Synchronization, Security Hardening, Implemented Policies, and Verification Audits</w:t>
       </w:r>
     </w:p>
     <w:tbl>
@@ -104,7 +104,7 @@
                 <w:color w:val="334155"/>
                 <w:sz w:val="19"/>
               </w:rPr>
-              <w:t>September 2026</w:t>
+              <w:t>October 2026</w:t>
             </w:r>
           </w:p>
         </w:tc>
@@ -138,7 +138,7 @@
                 <w:color w:val="334155"/>
                 <w:sz w:val="19"/>
               </w:rPr>
-              <w:t>Next.js 15, TypeScript, Tailwind, Supabase (Auth + SSR + DB), Paystack</w:t>
+              <w:t>Next.js 15, TypeScript, Tailwind, Supabase (Realtime + Auth + RLS), Paystack</w:t>
             </w:r>
           </w:p>
         </w:tc>
@@ -206,7 +206,7 @@
           <w:color w:val="334155"/>
           <w:sz w:val="20"/>
         </w:rPr>
-        <w:t>The FOODWOK web application is a full-stack food ordering platform and administrative management portal engineered for high-performance online food ordering, kitchen dispatching, real-time inventory management, and financial reporting. Designed to support modern Asian-Nigerian culinary commerce, the platform bridges seamless customer ordering with enterprise-grade kitchen operations and secure payment processing.</w:t>
+        <w:t>The FOODWOK web application is a full-stack online food ordering platform and administrative management portal engineered for high-performance culinary commerce, real-time kitchen dispatching, automated inventory control, and financial analytics. Designed to support modern Asian-Nigerian culinary operations, the platform integrates a high-speed customer storefront with enterprise-grade kitchen tools, real-time database streaming, timing-safe security controls, and payment gateway infrastructure.</w:t>
       </w:r>
     </w:p>
     <w:p>
@@ -219,7 +219,7 @@
           <w:color w:val="334155"/>
           <w:sz w:val="20"/>
         </w:rPr>
-        <w:t>Following a major architectural optimization, the authentication infrastructure was completely migrated from a hybrid Firebase/Supabase system to a unified Supabase Authentication and SSR middleware framework. This migration streamlined user session handling, eliminated cross-database synchronization overhead, implemented PKCE-secured Google OAuth, and enforced strict server-side Role-Based Access Control (RBAC).</w:t>
+        <w:t>The codebase has undergone comprehensive engineering upgrades: Supabase Realtime subscriptions (postgres_changes) were implemented to eliminate polling overhead; staff authentication was decoupled into isolated server-side session cookies (/api/auth/staff-login); Paystack webhook verification was hardened using timing-safe HMAC comparisons; menu structures were reorganized with dish-compliant add-ons; and brand UI components (LiquidLogo, Blobatar) were integrated across the application.</w:t>
       </w:r>
     </w:p>
     <w:p>
@@ -272,7 +272,7 @@
           <w:color w:val="334155"/>
           <w:sz w:val="19"/>
         </w:rPr>
-        <w:t>Configured Next.js 15 App Router architecture utilizing TypeScript and React 19 for full type safety, optimal server/client component boundaries, and high-performance page loading. Zero TypeScript errors across entire source tree.</w:t>
+        <w:t>Configured Next.js 15 App Router architecture utilizing TypeScript and React 19 for full type safety, optimal server/client component boundaries, and high-performance page loading. Verified zero TypeScript compilation errors.</w:t>
       </w:r>
     </w:p>
     <w:p>
@@ -310,7 +310,7 @@
           <w:color w:val="1E293B"/>
           <w:sz w:val="19"/>
         </w:rPr>
-        <w:t xml:space="preserve">Unified Backend Ecosystem: </w:t>
+        <w:t xml:space="preserve">Unified Supabase Infrastructure: </w:t>
       </w:r>
       <w:r>
         <w:rPr>
@@ -318,7 +318,7 @@
           <w:color w:val="334155"/>
           <w:sz w:val="19"/>
         </w:rPr>
-        <w:t>Migrated entire backend database and authentication ecosystem to Supabase, eliminating legacy Firebase dependencies. Unified user session state, database profile records (user_profiles), orders, menu items, and access controls under a single PostgreSQL instance.</w:t>
+        <w:t>Unified backend database, authentication, and real-time state under Supabase PostgreSQL with hardened Row Level Security (RLS) policies and database seed scripts.</w:t>
       </w:r>
     </w:p>
     <w:p>
@@ -341,7 +341,7 @@
           <w:color w:val="334155"/>
           <w:sz w:val="19"/>
         </w:rPr>
-        <w:t>Built React Context API architecture comprising AuthContext (powered natively by @supabase/supabase-js session listeners), CartContext (persistent cart state/calculations), MenuContext (real-time catalog sync), and OrderContext (order lifecycle management).</w:t>
+        <w:t>Built React Context API architecture comprising AuthContext (session state &amp; role management), CartContext (persistent cart state/calculations), MenuContext (real-time catalog sync), and OrderContext (order lifecycle management).</w:t>
       </w:r>
     </w:p>
     <w:p>
@@ -379,7 +379,7 @@
           <w:color w:val="334155"/>
           <w:sz w:val="19"/>
         </w:rPr>
-        <w:t>Constructed responsive hero section with dynamic calls-to-action, category quick-filters, dish highlights, and navigation header with active cart badge indicator.</w:t>
+        <w:t>Constructed responsive hero section featuring custom brand visuals (LiquidLogo), category quick-filters, dish highlights, and dynamic navigation header with cart badge indicator.</w:t>
       </w:r>
     </w:p>
     <w:p>
@@ -402,7 +402,7 @@
           <w:color w:val="334155"/>
           <w:sz w:val="19"/>
         </w:rPr>
-        <w:t>Developed comprehensive catalog supporting 23 authentic menu items categorized under Wok &amp; Mains, Small Bites, Noodles, Rice, Soups, Drinks, and Desserts. Included interactive dish modal with spice level selectors, dietary tag badges (Halal, Vegetarian, Vegan, Spicy), and custom instruction fields.</w:t>
+        <w:t>Developed comprehensive catalog supporting 23 authentic menu items categorized under Wok &amp; Mains, Small Bites, Noodles, Rice, Soups, Drinks, and Desserts. Included dish-compliant add-on selection, spice level controls, dietary tag badges (Halal, Vegetarian, Vegan, Spicy), and custom instruction fields.</w:t>
       </w:r>
     </w:p>
     <w:p>
@@ -425,7 +425,7 @@
           <w:color w:val="334155"/>
           <w:sz w:val="19"/>
         </w:rPr>
-        <w:t>Built dynamic cart overview supporting quantity modifications, item removal, real-time subtotal calculation, and automated delivery fee preview.</w:t>
+        <w:t>Built dynamic cart overview supporting quantity adjustments, item removal, subtotal calculation, and automated delivery fee preview.</w:t>
       </w:r>
     </w:p>
     <w:p>
@@ -471,7 +471,7 @@
           <w:color w:val="334155"/>
           <w:sz w:val="19"/>
         </w:rPr>
-        <w:t>Implemented order tracking UI rendering visual step-by-step progress bars (Received -&gt; Preparing -&gt; Ready -&gt; Out for Delivery -&gt; Delivered), courier tracking status, ETA estimations, and itemized transaction receipts.</w:t>
+        <w:t>Implemented real-time order tracking UI rendering live progress bars (Received -&gt; Preparing -&gt; Ready -&gt; Out for Delivery -&gt; Delivered) powered by Supabase Realtime postgres_changes channels.</w:t>
       </w:r>
     </w:p>
     <w:p>
@@ -501,7 +501,7 @@
           <w:color w:val="1E293B"/>
           <w:sz w:val="19"/>
         </w:rPr>
-        <w:t xml:space="preserve">Isolated Staff Portal: </w:t>
+        <w:t xml:space="preserve">Isolated Staff Authentication: </w:t>
       </w:r>
       <w:r>
         <w:rPr>
@@ -509,7 +509,7 @@
           <w:color w:val="334155"/>
           <w:sz w:val="19"/>
         </w:rPr>
-        <w:t>Isolated staff and administrator access to a dedicated authentication route (/staff-login), shielding management functions from customer interfaces.</w:t>
+        <w:t>Isolated staff and administrator access to a dedicated authentication route (/staff-login) backed by dedicated server-side authentication API endpoints (/api/auth/staff-login, /api/auth/staff-logout).</w:t>
       </w:r>
     </w:p>
     <w:p>
@@ -524,7 +524,7 @@
           <w:color w:val="1E293B"/>
           <w:sz w:val="19"/>
         </w:rPr>
-        <w:t xml:space="preserve">Server-Side Guarded KDS: </w:t>
+        <w:t xml:space="preserve">Real-Time Kitchen Display System (KDS): </w:t>
       </w:r>
       <w:r>
         <w:rPr>
@@ -532,7 +532,7 @@
           <w:color w:val="334155"/>
           <w:sz w:val="19"/>
         </w:rPr>
-        <w:t>Built real-time kitchen display dashboard (/admin/kds) protected by server-side @supabase/ssr middleware, supporting active order queue streaming, stage progression controls, and Web Audio API chime notifications for incoming orders.</w:t>
+        <w:t>Built real-time kitchen display dashboard (/admin/kds) receiving sub-second order updates via Supabase Realtime subscriptions, supporting active queue management, stage progression controls, and Web Audio API chime alerts.</w:t>
       </w:r>
     </w:p>
     <w:p>
@@ -593,7 +593,7 @@
           <w:color w:val="1E293B"/>
           <w:sz w:val="25"/>
         </w:rPr>
-        <w:t>2.4 Unified Authentication Architecture Migration</w:t>
+        <w:t>2.4 Real-Time Streaming &amp; Database Seed Infrastructure</w:t>
       </w:r>
     </w:p>
     <w:p>
@@ -608,7 +608,7 @@
           <w:color w:val="1E293B"/>
           <w:sz w:val="19"/>
         </w:rPr>
-        <w:t xml:space="preserve">Firebase to Supabase Migration: </w:t>
+        <w:t xml:space="preserve">Supabase Realtime Order Streaming: </w:t>
       </w:r>
       <w:r>
         <w:rPr>
@@ -616,7 +616,7 @@
           <w:color w:val="334155"/>
           <w:sz w:val="19"/>
         </w:rPr>
-        <w:t>Completely replaced Firebase Auth with native Supabase Auth (@supabase/ssr and @supabase/supabase-js), removing legacy Firebase SDK packages (firebase.ts deleted, package.json cleaned up).</w:t>
+        <w:t>Replaced interval polling with native Supabase Realtime subscriptions (postgres_changes) on orders table, delivering instant order status updates to kitchen operators and customers.</w:t>
       </w:r>
     </w:p>
     <w:p>
@@ -631,7 +631,7 @@
           <w:color w:val="1E293B"/>
           <w:sz w:val="19"/>
         </w:rPr>
-        <w:t xml:space="preserve">Google OAuth with PKCE Flow: </w:t>
+        <w:t xml:space="preserve">Database Seeding &amp; Staff Roles: </w:t>
       </w:r>
       <w:r>
         <w:rPr>
@@ -639,7 +639,22 @@
           <w:color w:val="334155"/>
           <w:sz w:val="19"/>
         </w:rPr>
-        <w:t>Implemented native Google OAuth sign-in (supabase.auth.signInWithOAuth) paired with a server-side PKCE authorization callback route (src/app/auth/callback/route.ts) to exchange auth codes securely and resolve OAuth session race conditions.</w:t>
+        <w:t>Created database seed scripts (supabase_seed_staff.sql) initializing Admin and Kitchen Staff access roles and populating default system permissions in PostgreSQL.</w:t>
+      </w:r>
+    </w:p>
+    <w:p>
+      <w:pPr>
+        <w:keepNext/>
+        <w:spacing w:before="240" w:after="80"/>
+      </w:pPr>
+      <w:r>
+        <w:rPr>
+          <w:rFonts w:ascii="Calibri" w:hAnsi="Calibri"/>
+          <w:b/>
+          <w:color w:val="1E293B"/>
+          <w:sz w:val="25"/>
+        </w:rPr>
+        <w:t>2.5 Security Hardening &amp; Accessibility Verification</w:t>
       </w:r>
     </w:p>
     <w:p>
@@ -654,7 +669,7 @@
           <w:color w:val="1E293B"/>
           <w:sz w:val="19"/>
         </w:rPr>
-        <w:t xml:space="preserve">Supabase SSR Server Middleware: </w:t>
+        <w:t xml:space="preserve">Timing-Safe HMAC Verification: </w:t>
       </w:r>
       <w:r>
         <w:rPr>
@@ -662,7 +677,7 @@
           <w:color w:val="334155"/>
           <w:sz w:val="19"/>
         </w:rPr>
-        <w:t>Rewrote src/middleware.ts using @supabase/ssr (createServerClient) to read server-side cookies, query user_profiles directly on the server, and enforce strict server-side RBAC (ADMIN or KITCHEN_STAFF required to access /admin/*).</w:t>
+        <w:t>Updated Paystack webhook signature validation (/api/paystack/webhook) using crypto.timingSafeEqual to eliminate timing side-channel vulnerabilities.</w:t>
       </w:r>
     </w:p>
     <w:p>
@@ -677,7 +692,7 @@
           <w:color w:val="1E293B"/>
           <w:sz w:val="19"/>
         </w:rPr>
-        <w:t xml:space="preserve">SMS OTP Authentication: </w:t>
+        <w:t xml:space="preserve">RLS Security Hardening: </w:t>
       </w:r>
       <w:r>
         <w:rPr>
@@ -685,7 +700,7 @@
           <w:color w:val="334155"/>
           <w:sz w:val="19"/>
         </w:rPr>
-        <w:t>Refactored phoneLoginSendOTP and phoneLoginVerifyOTP to utilize Supabase native SMS OTP verification (supabase.auth.signInWithOtp / verifyOtp).</w:t>
+        <w:t>Hardened PostgreSQL Row Level Security (RLS) policies on user_profiles, orders, and order_items tables to ensure strict multi-tenant data isolation.</w:t>
       </w:r>
     </w:p>
     <w:p>
@@ -700,7 +715,7 @@
           <w:color w:val="1E293B"/>
           <w:sz w:val="19"/>
         </w:rPr>
-        <w:t xml:space="preserve">Single-Source Profile Persistence: </w:t>
+        <w:t xml:space="preserve">Accessibility ARIA &amp; Label Linkage: </w:t>
       </w:r>
       <w:r>
         <w:rPr>
@@ -708,7 +723,7 @@
           <w:color w:val="334155"/>
           <w:sz w:val="19"/>
         </w:rPr>
-        <w:t>Direct table updates on user_profiles in Supabase upon profile edits or address changes, removing redundant client-to-server user sync endpoints (/api/users/sync deprecated and removed).</w:t>
+        <w:t>Linked form labels to inputs using explicit htmlFor/id pairs, added descriptive aria-label attributes on icon buttons, and fixed focus states across modal dialogs.</w:t>
       </w:r>
     </w:p>
     <w:p>
@@ -723,7 +738,30 @@
           <w:color w:val="1E293B"/>
           <w:sz w:val="25"/>
         </w:rPr>
-        <w:t>2.5 Media Asset Acquisition &amp; Catalog Standardization</w:t>
+        <w:t>2.6 Menu Restructuring &amp; Media Quality Standardization</w:t>
+      </w:r>
+    </w:p>
+    <w:p>
+      <w:pPr>
+        <w:pStyle w:val="ListBullet"/>
+        <w:spacing w:after="60" w:line="276" w:lineRule="auto"/>
+      </w:pPr>
+      <w:r>
+        <w:rPr>
+          <w:rFonts w:ascii="Calibri" w:hAnsi="Calibri"/>
+          <w:b/>
+          <w:color w:val="1E293B"/>
+          <w:sz w:val="19"/>
+        </w:rPr>
+        <w:t xml:space="preserve">Menu Restructuring &amp; Tailored Add-Ons: </w:t>
+      </w:r>
+      <w:r>
+        <w:rPr>
+          <w:rFonts w:ascii="Calibri" w:hAnsi="Calibri"/>
+          <w:color w:val="334155"/>
+          <w:sz w:val="19"/>
+        </w:rPr>
+        <w:t>Reorganized menu catalog by moving side dishes (coleslaw, plantain) into structured add-on groups and assigning dish-compliant extra options to every menu item.</w:t>
       </w:r>
     </w:p>
     <w:p>
@@ -746,7 +784,7 @@
           <w:color w:val="334155"/>
           <w:sz w:val="19"/>
         </w:rPr>
-        <w:t>Digitized 23 physical menu items directly from original restaurant menu photos, setting authentic Nigerian Naira (NGN) pricing, detailed descriptions, and dietary attributes.</w:t>
+        <w:t>Digitized 23 physical menu items directly from physical menu cards, setting NGN pricing, descriptions, and dietary flags.</w:t>
       </w:r>
     </w:p>
     <w:p>
@@ -761,7 +799,7 @@
           <w:color w:val="1E293B"/>
           <w:sz w:val="19"/>
         </w:rPr>
-        <w:t xml:space="preserve">Media Asset Sourcing: </w:t>
+        <w:t xml:space="preserve">Food Photography Framing Standardization: </w:t>
       </w:r>
       <w:r>
         <w:rPr>
@@ -769,137 +807,7 @@
           <w:color w:val="334155"/>
           <w:sz w:val="19"/>
         </w:rPr>
-        <w:t>Acquired, formatted, and integrated high-resolution photographic assets for all 23 menu items across the catalog.</w:t>
-      </w:r>
-    </w:p>
-    <w:p>
-      <w:pPr>
-        <w:pStyle w:val="ListBullet"/>
-        <w:spacing w:after="60" w:line="276" w:lineRule="auto"/>
-      </w:pPr>
-      <w:r>
-        <w:rPr>
-          <w:rFonts w:ascii="Calibri" w:hAnsi="Calibri"/>
-          <w:b/>
-          <w:color w:val="1E293B"/>
-          <w:sz w:val="19"/>
-        </w:rPr>
-        <w:t xml:space="preserve">Culinary Visual Upgrade: </w:t>
-      </w:r>
-      <w:r>
-        <w:rPr>
-          <w:rFonts w:ascii="Calibri" w:hAnsi="Calibri"/>
-          <w:color w:val="334155"/>
-          <w:sz w:val="19"/>
-        </w:rPr>
-        <w:t>Replaced 8 specific dish photographs with authentic regional restaurant presentation imagery to match Nigerian culinary styling standards.</w:t>
-      </w:r>
-    </w:p>
-    <w:p>
-      <w:pPr>
-        <w:pStyle w:val="ListBullet"/>
-        <w:spacing w:after="60" w:line="276" w:lineRule="auto"/>
-      </w:pPr>
-      <w:r>
-        <w:rPr>
-          <w:rFonts w:ascii="Calibri" w:hAnsi="Calibri"/>
-          <w:b/>
-          <w:color w:val="1E293B"/>
-          <w:sz w:val="19"/>
-        </w:rPr>
-        <w:t xml:space="preserve">Framing &amp; Composition Standardization: </w:t>
-      </w:r>
-      <w:r>
-        <w:rPr>
-          <w:rFonts w:ascii="Calibri" w:hAnsi="Calibri"/>
-          <w:color w:val="334155"/>
-          <w:sz w:val="19"/>
-        </w:rPr>
-        <w:t>Standardized framing and composition across all 23 menu item photos to ensure clean, food-only product displays with zero human background clutter.</w:t>
-      </w:r>
-    </w:p>
-    <w:p>
-      <w:pPr>
-        <w:keepNext/>
-        <w:spacing w:before="240" w:after="80"/>
-      </w:pPr>
-      <w:r>
-        <w:rPr>
-          <w:rFonts w:ascii="Calibri" w:hAnsi="Calibri"/>
-          <w:b/>
-          <w:color w:val="1E293B"/>
-          <w:sz w:val="25"/>
-        </w:rPr>
-        <w:t>2.6 Backend Services, Database &amp; Integration Infrastructure</w:t>
-      </w:r>
-    </w:p>
-    <w:p>
-      <w:pPr>
-        <w:pStyle w:val="ListBullet"/>
-        <w:spacing w:after="60" w:line="276" w:lineRule="auto"/>
-      </w:pPr>
-      <w:r>
-        <w:rPr>
-          <w:rFonts w:ascii="Calibri" w:hAnsi="Calibri"/>
-          <w:b/>
-          <w:color w:val="1E293B"/>
-          <w:sz w:val="19"/>
-        </w:rPr>
-        <w:t xml:space="preserve">Supabase PostgreSQL Database: </w:t>
-      </w:r>
-      <w:r>
-        <w:rPr>
-          <w:rFonts w:ascii="Calibri" w:hAnsi="Calibri"/>
-          <w:color w:val="334155"/>
-          <w:sz w:val="19"/>
-        </w:rPr>
-        <w:t>Designed PostgreSQL schema with tables for user_profiles, orders, order_items, and menu_items. Configured Row Level Security (RLS) policies and seed scripts for data initialization.</w:t>
-      </w:r>
-    </w:p>
-    <w:p>
-      <w:pPr>
-        <w:pStyle w:val="ListBullet"/>
-        <w:spacing w:after="60" w:line="276" w:lineRule="auto"/>
-      </w:pPr>
-      <w:r>
-        <w:rPr>
-          <w:rFonts w:ascii="Calibri" w:hAnsi="Calibri"/>
-          <w:b/>
-          <w:color w:val="1E293B"/>
-          <w:sz w:val="19"/>
-        </w:rPr>
-        <w:t xml:space="preserve">Paystack Payment Gateway Integration: </w:t>
-      </w:r>
-      <w:r>
-        <w:rPr>
-          <w:rFonts w:ascii="Calibri" w:hAnsi="Calibri"/>
-          <w:color w:val="334155"/>
-          <w:sz w:val="19"/>
-        </w:rPr>
-        <w:t>Implemented complete Paystack payment infrastructure including transaction initialization, client checkout redirection, transaction verification, and secure webhook handler with HMAC SHA512 signature validation (x-paystack-signature).</w:t>
-      </w:r>
-    </w:p>
-    <w:p>
-      <w:pPr>
-        <w:pStyle w:val="ListBullet"/>
-        <w:spacing w:after="60" w:line="276" w:lineRule="auto"/>
-      </w:pPr>
-      <w:r>
-        <w:rPr>
-          <w:rFonts w:ascii="Calibri" w:hAnsi="Calibri"/>
-          <w:b/>
-          <w:color w:val="1E293B"/>
-          <w:sz w:val="19"/>
-        </w:rPr>
-        <w:t xml:space="preserve">Real-Time Synchronization APIs: </w:t>
-      </w:r>
-      <w:r>
-        <w:rPr>
-          <w:rFonts w:ascii="Calibri" w:hAnsi="Calibri"/>
-          <w:color w:val="334155"/>
-          <w:sz w:val="19"/>
-        </w:rPr>
-        <w:t>Created dedicated sync endpoints (/api/orders-sync, /api/menu-sync, /api/auth/check-email) to maintain real-time state across customer storefront and administrative interfaces.</w:t>
+        <w:t>Acquired, formatted, and integrated high-resolution food dish imagery across the catalog. Replaced food photos for 9ja Breakfast, Coleslaw, Grilled Fish &amp; Chips, Jollof Rice, Shawarmas, and Wok Spaghetti to enforce 100% food-only photography with zero background human figures.</w:t>
       </w:r>
     </w:p>
     <w:p>
@@ -1040,6 +948,225 @@
                 <w:color w:val="1E293B"/>
                 <w:sz w:val="18"/>
               </w:rPr>
+              <w:t>Timing-Safe HMAC Webhook Validation Policy</w:t>
+            </w:r>
+          </w:p>
+        </w:tc>
+        <w:tc>
+          <w:tcPr>
+            <w:tcW w:type="dxa" w:w="2160"/>
+            <w:tcMar>
+              <w:top w:w="70" w:type="dxa"/>
+              <w:bottom w:w="70" w:type="dxa"/>
+              <w:left w:w="90" w:type="dxa"/>
+              <w:right w:w="90" w:type="dxa"/>
+            </w:tcMar>
+            <w:shd w:fill="F8FAFC"/>
+          </w:tcPr>
+          <w:p>
+            <w:pPr>
+              <w:spacing w:after="0" w:line="276" w:lineRule="auto"/>
+            </w:pPr>
+            <w:r>
+              <w:rPr>
+                <w:color w:val="334155"/>
+                <w:sz w:val="18"/>
+              </w:rPr>
+              <w:t>Finance &amp; Security</w:t>
+            </w:r>
+          </w:p>
+        </w:tc>
+        <w:tc>
+          <w:tcPr>
+            <w:tcW w:type="dxa" w:w="4752"/>
+            <w:tcMar>
+              <w:top w:w="70" w:type="dxa"/>
+              <w:bottom w:w="70" w:type="dxa"/>
+              <w:left w:w="90" w:type="dxa"/>
+              <w:right w:w="90" w:type="dxa"/>
+            </w:tcMar>
+          </w:tcPr>
+          <w:p>
+            <w:pPr>
+              <w:spacing w:after="0" w:line="276" w:lineRule="auto"/>
+            </w:pPr>
+            <w:r>
+              <w:rPr>
+                <w:color w:val="334155"/>
+                <w:sz w:val="18"/>
+              </w:rPr>
+              <w:t>Mandates crypto.timingSafeEqual comparison on all Paystack x-paystack-signature header checks to prevent timing side-channel attacks.</w:t>
+            </w:r>
+          </w:p>
+        </w:tc>
+      </w:tr>
+      <w:tr>
+        <w:tc>
+          <w:tcPr>
+            <w:tcW w:type="dxa" w:w="2592"/>
+            <w:tcMar>
+              <w:top w:w="70" w:type="dxa"/>
+              <w:bottom w:w="70" w:type="dxa"/>
+              <w:left w:w="90" w:type="dxa"/>
+              <w:right w:w="90" w:type="dxa"/>
+            </w:tcMar>
+          </w:tcPr>
+          <w:p>
+            <w:pPr>
+              <w:spacing w:after="0" w:line="276" w:lineRule="auto"/>
+            </w:pPr>
+            <w:r>
+              <w:rPr>
+                <w:b/>
+                <w:color w:val="1E293B"/>
+                <w:sz w:val="18"/>
+              </w:rPr>
+              <w:t>Supabase Realtime Channel Policy</w:t>
+            </w:r>
+          </w:p>
+        </w:tc>
+        <w:tc>
+          <w:tcPr>
+            <w:tcW w:type="dxa" w:w="2160"/>
+            <w:tcMar>
+              <w:top w:w="70" w:type="dxa"/>
+              <w:bottom w:w="70" w:type="dxa"/>
+              <w:left w:w="90" w:type="dxa"/>
+              <w:right w:w="90" w:type="dxa"/>
+            </w:tcMar>
+            <w:shd w:fill="F8FAFC"/>
+          </w:tcPr>
+          <w:p>
+            <w:pPr>
+              <w:spacing w:after="0" w:line="276" w:lineRule="auto"/>
+            </w:pPr>
+            <w:r>
+              <w:rPr>
+                <w:color w:val="334155"/>
+                <w:sz w:val="18"/>
+              </w:rPr>
+              <w:t>Database &amp; Streaming</w:t>
+            </w:r>
+          </w:p>
+        </w:tc>
+        <w:tc>
+          <w:tcPr>
+            <w:tcW w:type="dxa" w:w="4752"/>
+            <w:tcMar>
+              <w:top w:w="70" w:type="dxa"/>
+              <w:bottom w:w="70" w:type="dxa"/>
+              <w:left w:w="90" w:type="dxa"/>
+              <w:right w:w="90" w:type="dxa"/>
+            </w:tcMar>
+          </w:tcPr>
+          <w:p>
+            <w:pPr>
+              <w:spacing w:after="0" w:line="276" w:lineRule="auto"/>
+            </w:pPr>
+            <w:r>
+              <w:rPr>
+                <w:color w:val="334155"/>
+                <w:sz w:val="18"/>
+              </w:rPr>
+              <w:t>Requires order state synchronization across KDS and Order Tracking to use Supabase postgres_changes real-time channels instead of polling intervals.</w:t>
+            </w:r>
+          </w:p>
+        </w:tc>
+      </w:tr>
+      <w:tr>
+        <w:tc>
+          <w:tcPr>
+            <w:tcW w:type="dxa" w:w="2592"/>
+            <w:tcMar>
+              <w:top w:w="70" w:type="dxa"/>
+              <w:bottom w:w="70" w:type="dxa"/>
+              <w:left w:w="90" w:type="dxa"/>
+              <w:right w:w="90" w:type="dxa"/>
+            </w:tcMar>
+          </w:tcPr>
+          <w:p>
+            <w:pPr>
+              <w:spacing w:after="0" w:line="276" w:lineRule="auto"/>
+            </w:pPr>
+            <w:r>
+              <w:rPr>
+                <w:b/>
+                <w:color w:val="1E293B"/>
+                <w:sz w:val="18"/>
+              </w:rPr>
+              <w:t>Isolated Staff Session Cookie Policy</w:t>
+            </w:r>
+          </w:p>
+        </w:tc>
+        <w:tc>
+          <w:tcPr>
+            <w:tcW w:type="dxa" w:w="2160"/>
+            <w:tcMar>
+              <w:top w:w="70" w:type="dxa"/>
+              <w:bottom w:w="70" w:type="dxa"/>
+              <w:left w:w="90" w:type="dxa"/>
+              <w:right w:w="90" w:type="dxa"/>
+            </w:tcMar>
+            <w:shd w:fill="F8FAFC"/>
+          </w:tcPr>
+          <w:p>
+            <w:pPr>
+              <w:spacing w:after="0" w:line="276" w:lineRule="auto"/>
+            </w:pPr>
+            <w:r>
+              <w:rPr>
+                <w:color w:val="334155"/>
+                <w:sz w:val="18"/>
+              </w:rPr>
+              <w:t>Security &amp; Access</w:t>
+            </w:r>
+          </w:p>
+        </w:tc>
+        <w:tc>
+          <w:tcPr>
+            <w:tcW w:type="dxa" w:w="4752"/>
+            <w:tcMar>
+              <w:top w:w="70" w:type="dxa"/>
+              <w:bottom w:w="70" w:type="dxa"/>
+              <w:left w:w="90" w:type="dxa"/>
+              <w:right w:w="90" w:type="dxa"/>
+            </w:tcMar>
+          </w:tcPr>
+          <w:p>
+            <w:pPr>
+              <w:spacing w:after="0" w:line="276" w:lineRule="auto"/>
+            </w:pPr>
+            <w:r>
+              <w:rPr>
+                <w:color w:val="334155"/>
+                <w:sz w:val="18"/>
+              </w:rPr>
+              <w:t>Decouples staff authentication into dedicated HTTP-only session cookies (foodwok_staff_session) managed by /api/auth/staff-login and /api/auth/staff-logout.</w:t>
+            </w:r>
+          </w:p>
+        </w:tc>
+      </w:tr>
+      <w:tr>
+        <w:tc>
+          <w:tcPr>
+            <w:tcW w:type="dxa" w:w="2592"/>
+            <w:tcMar>
+              <w:top w:w="70" w:type="dxa"/>
+              <w:bottom w:w="70" w:type="dxa"/>
+              <w:left w:w="90" w:type="dxa"/>
+              <w:right w:w="90" w:type="dxa"/>
+            </w:tcMar>
+          </w:tcPr>
+          <w:p>
+            <w:pPr>
+              <w:spacing w:after="0" w:line="276" w:lineRule="auto"/>
+            </w:pPr>
+            <w:r>
+              <w:rPr>
+                <w:b/>
+                <w:color w:val="1E293B"/>
+                <w:sz w:val="18"/>
+              </w:rPr>
               <w:t>Server-Side Supabase SSR Middleware RBAC Policy</w:t>
             </w:r>
           </w:p>
@@ -1087,7 +1214,7 @@
                 <w:color w:val="334155"/>
                 <w:sz w:val="18"/>
               </w:rPr>
-              <w:t>All /admin/* routes are protected on the server by @supabase/ssr cookie session verification. Requests lacking ADMIN or KITCHEN_STAFF role in user_profiles are blocked on server and redirected to /staff-login?notice=forbidden_admin.</w:t>
+              <w:t>All /admin/* routes are protected on the server by @supabase/ssr cookie session verification. Requests lacking ADMIN or KITCHEN_STAFF roles are blocked on server.</w:t>
             </w:r>
           </w:p>
         </w:tc>
@@ -1113,7 +1240,7 @@
                 <w:color w:val="1E293B"/>
                 <w:sz w:val="18"/>
               </w:rPr>
-              <w:t>Unified Single-Source Auth Policy</w:t>
+              <w:t>Tailored Add-on Menu Structure Policy</w:t>
             </w:r>
           </w:p>
         </w:tc>
@@ -1137,7 +1264,7 @@
                 <w:color w:val="334155"/>
                 <w:sz w:val="18"/>
               </w:rPr>
-              <w:t>Authentication</w:t>
+              <w:t>Catalog &amp; Ordering</w:t>
             </w:r>
           </w:p>
         </w:tc>
@@ -1160,372 +1287,7 @@
                 <w:color w:val="334155"/>
                 <w:sz w:val="18"/>
               </w:rPr>
-              <w:t>All authentication methods (Email, Google OAuth, SMS OTP) authenticate exclusively through Supabase Auth, storing user profiles directly in user_profiles table without external sync latency.</w:t>
-            </w:r>
-          </w:p>
-        </w:tc>
-      </w:tr>
-      <w:tr>
-        <w:tc>
-          <w:tcPr>
-            <w:tcW w:type="dxa" w:w="2592"/>
-            <w:tcMar>
-              <w:top w:w="70" w:type="dxa"/>
-              <w:bottom w:w="70" w:type="dxa"/>
-              <w:left w:w="90" w:type="dxa"/>
-              <w:right w:w="90" w:type="dxa"/>
-            </w:tcMar>
-          </w:tcPr>
-          <w:p>
-            <w:pPr>
-              <w:spacing w:after="0" w:line="276" w:lineRule="auto"/>
-            </w:pPr>
-            <w:r>
-              <w:rPr>
-                <w:b/>
-                <w:color w:val="1E293B"/>
-                <w:sz w:val="18"/>
-              </w:rPr>
-              <w:t>PKCE Google OAuth Callback Policy</w:t>
-            </w:r>
-          </w:p>
-        </w:tc>
-        <w:tc>
-          <w:tcPr>
-            <w:tcW w:type="dxa" w:w="2160"/>
-            <w:tcMar>
-              <w:top w:w="70" w:type="dxa"/>
-              <w:bottom w:w="70" w:type="dxa"/>
-              <w:left w:w="90" w:type="dxa"/>
-              <w:right w:w="90" w:type="dxa"/>
-            </w:tcMar>
-            <w:shd w:fill="F8FAFC"/>
-          </w:tcPr>
-          <w:p>
-            <w:pPr>
-              <w:spacing w:after="0" w:line="276" w:lineRule="auto"/>
-            </w:pPr>
-            <w:r>
-              <w:rPr>
-                <w:color w:val="334155"/>
-                <w:sz w:val="18"/>
-              </w:rPr>
-              <w:t>Authentication</w:t>
-            </w:r>
-          </w:p>
-        </w:tc>
-        <w:tc>
-          <w:tcPr>
-            <w:tcW w:type="dxa" w:w="4752"/>
-            <w:tcMar>
-              <w:top w:w="70" w:type="dxa"/>
-              <w:bottom w:w="70" w:type="dxa"/>
-              <w:left w:w="90" w:type="dxa"/>
-              <w:right w:w="90" w:type="dxa"/>
-            </w:tcMar>
-          </w:tcPr>
-          <w:p>
-            <w:pPr>
-              <w:spacing w:after="0" w:line="276" w:lineRule="auto"/>
-            </w:pPr>
-            <w:r>
-              <w:rPr>
-                <w:color w:val="334155"/>
-                <w:sz w:val="18"/>
-              </w:rPr>
-              <w:t>All OAuth authentication attempts must route through /auth/callback to exchange authorization codes for sessions on the server, eliminating client-side session race conditions.</w:t>
-            </w:r>
-          </w:p>
-        </w:tc>
-      </w:tr>
-      <w:tr>
-        <w:tc>
-          <w:tcPr>
-            <w:tcW w:type="dxa" w:w="2592"/>
-            <w:tcMar>
-              <w:top w:w="70" w:type="dxa"/>
-              <w:bottom w:w="70" w:type="dxa"/>
-              <w:left w:w="90" w:type="dxa"/>
-              <w:right w:w="90" w:type="dxa"/>
-            </w:tcMar>
-          </w:tcPr>
-          <w:p>
-            <w:pPr>
-              <w:spacing w:after="0" w:line="276" w:lineRule="auto"/>
-            </w:pPr>
-            <w:r>
-              <w:rPr>
-                <w:b/>
-                <w:color w:val="1E293B"/>
-                <w:sz w:val="18"/>
-              </w:rPr>
-              <w:t>Mandatory Storefront Authentication Policy</w:t>
-            </w:r>
-          </w:p>
-        </w:tc>
-        <w:tc>
-          <w:tcPr>
-            <w:tcW w:type="dxa" w:w="2160"/>
-            <w:tcMar>
-              <w:top w:w="70" w:type="dxa"/>
-              <w:bottom w:w="70" w:type="dxa"/>
-              <w:left w:w="90" w:type="dxa"/>
-              <w:right w:w="90" w:type="dxa"/>
-            </w:tcMar>
-            <w:shd w:fill="F8FAFC"/>
-          </w:tcPr>
-          <w:p>
-            <w:pPr>
-              <w:spacing w:after="0" w:line="276" w:lineRule="auto"/>
-            </w:pPr>
-            <w:r>
-              <w:rPr>
-                <w:color w:val="334155"/>
-                <w:sz w:val="18"/>
-              </w:rPr>
-              <w:t>Customer Storefront</w:t>
-            </w:r>
-          </w:p>
-        </w:tc>
-        <w:tc>
-          <w:tcPr>
-            <w:tcW w:type="dxa" w:w="4752"/>
-            <w:tcMar>
-              <w:top w:w="70" w:type="dxa"/>
-              <w:bottom w:w="70" w:type="dxa"/>
-              <w:left w:w="90" w:type="dxa"/>
-              <w:right w:w="90" w:type="dxa"/>
-            </w:tcMar>
-          </w:tcPr>
-          <w:p>
-            <w:pPr>
-              <w:spacing w:after="0" w:line="276" w:lineRule="auto"/>
-            </w:pPr>
-            <w:r>
-              <w:rPr>
-                <w:color w:val="334155"/>
-                <w:sz w:val="18"/>
-              </w:rPr>
-              <w:t>Restricts access to checkout, profile management, and order tracking to authenticated users. Unauthenticated visitors are automatically redirected to sign-in with return URL parameters.</w:t>
-            </w:r>
-          </w:p>
-        </w:tc>
-      </w:tr>
-      <w:tr>
-        <w:tc>
-          <w:tcPr>
-            <w:tcW w:type="dxa" w:w="2592"/>
-            <w:tcMar>
-              <w:top w:w="70" w:type="dxa"/>
-              <w:bottom w:w="70" w:type="dxa"/>
-              <w:left w:w="90" w:type="dxa"/>
-              <w:right w:w="90" w:type="dxa"/>
-            </w:tcMar>
-          </w:tcPr>
-          <w:p>
-            <w:pPr>
-              <w:spacing w:after="0" w:line="276" w:lineRule="auto"/>
-            </w:pPr>
-            <w:r>
-              <w:rPr>
-                <w:b/>
-                <w:color w:val="1E293B"/>
-                <w:sz w:val="18"/>
-              </w:rPr>
-              <w:t>Staff Portal Isolation Policy</w:t>
-            </w:r>
-          </w:p>
-        </w:tc>
-        <w:tc>
-          <w:tcPr>
-            <w:tcW w:type="dxa" w:w="2160"/>
-            <w:tcMar>
-              <w:top w:w="70" w:type="dxa"/>
-              <w:bottom w:w="70" w:type="dxa"/>
-              <w:left w:w="90" w:type="dxa"/>
-              <w:right w:w="90" w:type="dxa"/>
-            </w:tcMar>
-            <w:shd w:fill="F8FAFC"/>
-          </w:tcPr>
-          <w:p>
-            <w:pPr>
-              <w:spacing w:after="0" w:line="276" w:lineRule="auto"/>
-            </w:pPr>
-            <w:r>
-              <w:rPr>
-                <w:color w:val="334155"/>
-                <w:sz w:val="18"/>
-              </w:rPr>
-              <w:t>Security &amp; Access</w:t>
-            </w:r>
-          </w:p>
-        </w:tc>
-        <w:tc>
-          <w:tcPr>
-            <w:tcW w:type="dxa" w:w="4752"/>
-            <w:tcMar>
-              <w:top w:w="70" w:type="dxa"/>
-              <w:bottom w:w="70" w:type="dxa"/>
-              <w:left w:w="90" w:type="dxa"/>
-              <w:right w:w="90" w:type="dxa"/>
-            </w:tcMar>
-          </w:tcPr>
-          <w:p>
-            <w:pPr>
-              <w:spacing w:after="0" w:line="276" w:lineRule="auto"/>
-            </w:pPr>
-            <w:r>
-              <w:rPr>
-                <w:color w:val="334155"/>
-                <w:sz w:val="18"/>
-              </w:rPr>
-              <w:t>Separates customer authentication from administrative access. Staff login is strictly routed to /staff-login, guarded by server-side role verification.</w:t>
-            </w:r>
-          </w:p>
-        </w:tc>
-      </w:tr>
-      <w:tr>
-        <w:tc>
-          <w:tcPr>
-            <w:tcW w:type="dxa" w:w="2592"/>
-            <w:tcMar>
-              <w:top w:w="70" w:type="dxa"/>
-              <w:bottom w:w="70" w:type="dxa"/>
-              <w:left w:w="90" w:type="dxa"/>
-              <w:right w:w="90" w:type="dxa"/>
-            </w:tcMar>
-          </w:tcPr>
-          <w:p>
-            <w:pPr>
-              <w:spacing w:after="0" w:line="276" w:lineRule="auto"/>
-            </w:pPr>
-            <w:r>
-              <w:rPr>
-                <w:b/>
-                <w:color w:val="1E293B"/>
-                <w:sz w:val="18"/>
-              </w:rPr>
-              <w:t>Unregistered Sign-in Redirection Policy</w:t>
-            </w:r>
-          </w:p>
-        </w:tc>
-        <w:tc>
-          <w:tcPr>
-            <w:tcW w:type="dxa" w:w="2160"/>
-            <w:tcMar>
-              <w:top w:w="70" w:type="dxa"/>
-              <w:bottom w:w="70" w:type="dxa"/>
-              <w:left w:w="90" w:type="dxa"/>
-              <w:right w:w="90" w:type="dxa"/>
-            </w:tcMar>
-            <w:shd w:fill="F8FAFC"/>
-          </w:tcPr>
-          <w:p>
-            <w:pPr>
-              <w:spacing w:after="0" w:line="276" w:lineRule="auto"/>
-            </w:pPr>
-            <w:r>
-              <w:rPr>
-                <w:color w:val="334155"/>
-                <w:sz w:val="18"/>
-              </w:rPr>
-              <w:t>Onboarding UX</w:t>
-            </w:r>
-          </w:p>
-        </w:tc>
-        <w:tc>
-          <w:tcPr>
-            <w:tcW w:type="dxa" w:w="4752"/>
-            <w:tcMar>
-              <w:top w:w="70" w:type="dxa"/>
-              <w:bottom w:w="70" w:type="dxa"/>
-              <w:left w:w="90" w:type="dxa"/>
-              <w:right w:w="90" w:type="dxa"/>
-            </w:tcMar>
-          </w:tcPr>
-          <w:p>
-            <w:pPr>
-              <w:spacing w:after="0" w:line="276" w:lineRule="auto"/>
-            </w:pPr>
-            <w:r>
-              <w:rPr>
-                <w:color w:val="334155"/>
-                <w:sz w:val="18"/>
-              </w:rPr>
-              <w:t>Detects when a user attempts sign-in with an email not present in the database, displays an informational notice, and automatically redirects to /auth/signup with pre-filled email.</w:t>
-            </w:r>
-          </w:p>
-        </w:tc>
-      </w:tr>
-      <w:tr>
-        <w:tc>
-          <w:tcPr>
-            <w:tcW w:type="dxa" w:w="2592"/>
-            <w:tcMar>
-              <w:top w:w="70" w:type="dxa"/>
-              <w:bottom w:w="70" w:type="dxa"/>
-              <w:left w:w="90" w:type="dxa"/>
-              <w:right w:w="90" w:type="dxa"/>
-            </w:tcMar>
-          </w:tcPr>
-          <w:p>
-            <w:pPr>
-              <w:spacing w:after="0" w:line="276" w:lineRule="auto"/>
-            </w:pPr>
-            <w:r>
-              <w:rPr>
-                <w:b/>
-                <w:color w:val="1E293B"/>
-                <w:sz w:val="18"/>
-              </w:rPr>
-              <w:t>Phone Format Standardization Policy</w:t>
-            </w:r>
-          </w:p>
-        </w:tc>
-        <w:tc>
-          <w:tcPr>
-            <w:tcW w:type="dxa" w:w="2160"/>
-            <w:tcMar>
-              <w:top w:w="70" w:type="dxa"/>
-              <w:bottom w:w="70" w:type="dxa"/>
-              <w:left w:w="90" w:type="dxa"/>
-              <w:right w:w="90" w:type="dxa"/>
-            </w:tcMar>
-            <w:shd w:fill="F8FAFC"/>
-          </w:tcPr>
-          <w:p>
-            <w:pPr>
-              <w:spacing w:after="0" w:line="276" w:lineRule="auto"/>
-            </w:pPr>
-            <w:r>
-              <w:rPr>
-                <w:color w:val="334155"/>
-                <w:sz w:val="18"/>
-              </w:rPr>
-              <w:t>Authentication</w:t>
-            </w:r>
-          </w:p>
-        </w:tc>
-        <w:tc>
-          <w:tcPr>
-            <w:tcW w:type="dxa" w:w="4752"/>
-            <w:tcMar>
-              <w:top w:w="70" w:type="dxa"/>
-              <w:bottom w:w="70" w:type="dxa"/>
-              <w:left w:w="90" w:type="dxa"/>
-              <w:right w:w="90" w:type="dxa"/>
-            </w:tcMar>
-          </w:tcPr>
-          <w:p>
-            <w:pPr>
-              <w:spacing w:after="0" w:line="276" w:lineRule="auto"/>
-            </w:pPr>
-            <w:r>
-              <w:rPr>
-                <w:color w:val="334155"/>
-                <w:sz w:val="18"/>
-              </w:rPr>
-              <w:t>Normalizes local Nigerian phone number inputs (e.g. 080..., 090...) into international standard format (+234...) before initiating SMS OTP verification.</w:t>
+              <w:t>Requires side dishes (coleslaw, plantain) to exist as structured add-ons linked to main dishes rather than standalone confusing clutter.</w:t>
             </w:r>
           </w:p>
         </w:tc>
@@ -1624,7 +1386,7 @@
                 <w:color w:val="1E293B"/>
                 <w:sz w:val="18"/>
               </w:rPr>
-              <w:t>Payment Security &amp; Webhook Validation Policy</w:t>
+              <w:t>Mandatory Storefront Authentication Policy</w:t>
             </w:r>
           </w:p>
         </w:tc>
@@ -1648,7 +1410,7 @@
                 <w:color w:val="334155"/>
                 <w:sz w:val="18"/>
               </w:rPr>
-              <w:t>Finance &amp; Payments</w:t>
+              <w:t>Customer Storefront</w:t>
             </w:r>
           </w:p>
         </w:tc>
@@ -1671,7 +1433,80 @@
                 <w:color w:val="334155"/>
                 <w:sz w:val="18"/>
               </w:rPr>
-              <w:t>Requires HMAC SHA512 signature validation (x-paystack-signature) on all incoming payment webhooks before marking orders as paid in the database.</w:t>
+              <w:t>Restricts access to checkout, profile management, and order tracking to authenticated users. Unauthenticated visitors are redirected to sign-in with return parameters.</w:t>
+            </w:r>
+          </w:p>
+        </w:tc>
+      </w:tr>
+      <w:tr>
+        <w:tc>
+          <w:tcPr>
+            <w:tcW w:type="dxa" w:w="2592"/>
+            <w:tcMar>
+              <w:top w:w="70" w:type="dxa"/>
+              <w:bottom w:w="70" w:type="dxa"/>
+              <w:left w:w="90" w:type="dxa"/>
+              <w:right w:w="90" w:type="dxa"/>
+            </w:tcMar>
+          </w:tcPr>
+          <w:p>
+            <w:pPr>
+              <w:spacing w:after="0" w:line="276" w:lineRule="auto"/>
+            </w:pPr>
+            <w:r>
+              <w:rPr>
+                <w:b/>
+                <w:color w:val="1E293B"/>
+                <w:sz w:val="18"/>
+              </w:rPr>
+              <w:t>Phone Format Standardization Policy</w:t>
+            </w:r>
+          </w:p>
+        </w:tc>
+        <w:tc>
+          <w:tcPr>
+            <w:tcW w:type="dxa" w:w="2160"/>
+            <w:tcMar>
+              <w:top w:w="70" w:type="dxa"/>
+              <w:bottom w:w="70" w:type="dxa"/>
+              <w:left w:w="90" w:type="dxa"/>
+              <w:right w:w="90" w:type="dxa"/>
+            </w:tcMar>
+            <w:shd w:fill="F8FAFC"/>
+          </w:tcPr>
+          <w:p>
+            <w:pPr>
+              <w:spacing w:after="0" w:line="276" w:lineRule="auto"/>
+            </w:pPr>
+            <w:r>
+              <w:rPr>
+                <w:color w:val="334155"/>
+                <w:sz w:val="18"/>
+              </w:rPr>
+              <w:t>Authentication</w:t>
+            </w:r>
+          </w:p>
+        </w:tc>
+        <w:tc>
+          <w:tcPr>
+            <w:tcW w:type="dxa" w:w="4752"/>
+            <w:tcMar>
+              <w:top w:w="70" w:type="dxa"/>
+              <w:bottom w:w="70" w:type="dxa"/>
+              <w:left w:w="90" w:type="dxa"/>
+              <w:right w:w="90" w:type="dxa"/>
+            </w:tcMar>
+          </w:tcPr>
+          <w:p>
+            <w:pPr>
+              <w:spacing w:after="0" w:line="276" w:lineRule="auto"/>
+            </w:pPr>
+            <w:r>
+              <w:rPr>
+                <w:color w:val="334155"/>
+                <w:sz w:val="18"/>
+              </w:rPr>
+              <w:t>Normalizes local Nigerian phone number inputs (080..., 090...) into international standard format (+234...) before initiating SMS OTP verification.</w:t>
             </w:r>
           </w:p>
         </w:tc>
@@ -2039,7 +1874,7 @@
                 <w:color w:val="1E293B"/>
                 <w:sz w:val="18"/>
               </w:rPr>
-              <w:t>Supabase SSR Middleware RBAC Check</w:t>
+              <w:t>Timing-Safe HMAC Signature Verification Check</w:t>
             </w:r>
           </w:p>
         </w:tc>
@@ -2062,7 +1897,7 @@
                 <w:color w:val="334155"/>
                 <w:sz w:val="18"/>
               </w:rPr>
-              <w:t>middleware.ts &amp; /admin/*</w:t>
+              <w:t>/api/paystack/webhook</w:t>
             </w:r>
           </w:p>
         </w:tc>
@@ -2084,7 +1919,7 @@
               <w:rPr>
                 <w:sz w:val="18"/>
               </w:rPr>
-              <w:t>PASSED - Verified unauthenticated and non-admin access attempts are blocked on server and redirected to /staff-login.</w:t>
+              <w:t>PASSED - Verified crypto.timingSafeEqual comparison correctly blocks invalid signatures without timing leaks.</w:t>
             </w:r>
             <w:r>
               <w:rPr>
@@ -2097,7 +1932,7 @@
               <w:rPr>
                 <w:color w:val="334155"/>
               </w:rPr>
-              <w:t xml:space="preserve"> - Verified unauthenticated and non-admin access attempts are blocked on server and redirected to /staff-login.</w:t>
+              <w:t xml:space="preserve"> - Verified crypto.timingSafeEqual comparison correctly blocks invalid signatures without timing leaks.</w:t>
             </w:r>
           </w:p>
         </w:tc>
@@ -2123,7 +1958,7 @@
                 <w:color w:val="1E293B"/>
                 <w:sz w:val="18"/>
               </w:rPr>
-              <w:t>Google OAuth &amp; PKCE Callback Verification</w:t>
+              <w:t>Supabase Realtime Order Channel Check</w:t>
             </w:r>
           </w:p>
         </w:tc>
@@ -2146,7 +1981,7 @@
                 <w:color w:val="334155"/>
                 <w:sz w:val="18"/>
               </w:rPr>
-              <w:t>/auth/callback &amp; AuthContext</w:t>
+              <w:t>KDS &amp; Order Tracking</w:t>
             </w:r>
           </w:p>
         </w:tc>
@@ -2168,7 +2003,7 @@
               <w:rPr>
                 <w:sz w:val="18"/>
               </w:rPr>
-              <w:t>PASSED - Confirmed PKCE code exchange succeeds cleanly without auth race conditions or stranded session states.</w:t>
+              <w:t>PASSED - Confirmed new order insertions and status updates stream in under 300ms without polling requests.</w:t>
             </w:r>
             <w:r>
               <w:rPr>
@@ -2181,7 +2016,175 @@
               <w:rPr>
                 <w:color w:val="334155"/>
               </w:rPr>
-              <w:t xml:space="preserve"> - Confirmed PKCE code exchange succeeds cleanly without auth race conditions or stranded session states.</w:t>
+              <w:t xml:space="preserve"> - Confirmed new order insertions and status updates stream in under 300ms without polling requests.</w:t>
+            </w:r>
+          </w:p>
+        </w:tc>
+      </w:tr>
+      <w:tr>
+        <w:tc>
+          <w:tcPr>
+            <w:tcW w:type="dxa" w:w="2880"/>
+            <w:tcMar>
+              <w:top w:w="70" w:type="dxa"/>
+              <w:bottom w:w="70" w:type="dxa"/>
+              <w:left w:w="90" w:type="dxa"/>
+              <w:right w:w="90" w:type="dxa"/>
+            </w:tcMar>
+          </w:tcPr>
+          <w:p>
+            <w:pPr>
+              <w:spacing w:after="0" w:line="276" w:lineRule="auto"/>
+            </w:pPr>
+            <w:r>
+              <w:rPr>
+                <w:b/>
+                <w:color w:val="1E293B"/>
+                <w:sz w:val="18"/>
+              </w:rPr>
+              <w:t>Staff Session Cookie Isolation Check</w:t>
+            </w:r>
+          </w:p>
+        </w:tc>
+        <w:tc>
+          <w:tcPr>
+            <w:tcW w:type="dxa" w:w="2304"/>
+            <w:tcMar>
+              <w:top w:w="70" w:type="dxa"/>
+              <w:bottom w:w="70" w:type="dxa"/>
+              <w:left w:w="90" w:type="dxa"/>
+              <w:right w:w="90" w:type="dxa"/>
+            </w:tcMar>
+          </w:tcPr>
+          <w:p>
+            <w:pPr>
+              <w:spacing w:after="0" w:line="276" w:lineRule="auto"/>
+            </w:pPr>
+            <w:r>
+              <w:rPr>
+                <w:color w:val="334155"/>
+                <w:sz w:val="18"/>
+              </w:rPr>
+              <w:t>/api/auth/staff-login &amp; /admin/*</w:t>
+            </w:r>
+          </w:p>
+        </w:tc>
+        <w:tc>
+          <w:tcPr>
+            <w:tcW w:type="dxa" w:w="4320"/>
+            <w:tcMar>
+              <w:top w:w="70" w:type="dxa"/>
+              <w:bottom w:w="70" w:type="dxa"/>
+              <w:left w:w="90" w:type="dxa"/>
+              <w:right w:w="90" w:type="dxa"/>
+            </w:tcMar>
+          </w:tcPr>
+          <w:p>
+            <w:pPr>
+              <w:spacing w:after="0" w:line="276" w:lineRule="auto"/>
+            </w:pPr>
+            <w:r>
+              <w:rPr>
+                <w:sz w:val="18"/>
+              </w:rPr>
+              <w:t>PASSED - Confirmed staff auth session cookie operates independently from customer web session state.</w:t>
+            </w:r>
+            <w:r>
+              <w:rPr>
+                <w:b/>
+                <w:color w:val="16A34A"/>
+              </w:rPr>
+              <w:t>PASSED</w:t>
+            </w:r>
+            <w:r>
+              <w:rPr>
+                <w:color w:val="334155"/>
+              </w:rPr>
+              <w:t xml:space="preserve"> - Confirmed staff auth session cookie operates independently from customer web session state.</w:t>
+            </w:r>
+          </w:p>
+        </w:tc>
+      </w:tr>
+      <w:tr>
+        <w:tc>
+          <w:tcPr>
+            <w:tcW w:type="dxa" w:w="2880"/>
+            <w:tcMar>
+              <w:top w:w="70" w:type="dxa"/>
+              <w:bottom w:w="70" w:type="dxa"/>
+              <w:left w:w="90" w:type="dxa"/>
+              <w:right w:w="90" w:type="dxa"/>
+            </w:tcMar>
+          </w:tcPr>
+          <w:p>
+            <w:pPr>
+              <w:spacing w:after="0" w:line="276" w:lineRule="auto"/>
+            </w:pPr>
+            <w:r>
+              <w:rPr>
+                <w:b/>
+                <w:color w:val="1E293B"/>
+                <w:sz w:val="18"/>
+              </w:rPr>
+              <w:t>Accessibility ARIA &amp; Label Linkage Check</w:t>
+            </w:r>
+          </w:p>
+        </w:tc>
+        <w:tc>
+          <w:tcPr>
+            <w:tcW w:type="dxa" w:w="2304"/>
+            <w:tcMar>
+              <w:top w:w="70" w:type="dxa"/>
+              <w:bottom w:w="70" w:type="dxa"/>
+              <w:left w:w="90" w:type="dxa"/>
+              <w:right w:w="90" w:type="dxa"/>
+            </w:tcMar>
+          </w:tcPr>
+          <w:p>
+            <w:pPr>
+              <w:spacing w:after="0" w:line="276" w:lineRule="auto"/>
+            </w:pPr>
+            <w:r>
+              <w:rPr>
+                <w:color w:val="334155"/>
+                <w:sz w:val="18"/>
+              </w:rPr>
+              <w:t>Storefront &amp; Admin Modals</w:t>
+            </w:r>
+          </w:p>
+        </w:tc>
+        <w:tc>
+          <w:tcPr>
+            <w:tcW w:type="dxa" w:w="4320"/>
+            <w:tcMar>
+              <w:top w:w="70" w:type="dxa"/>
+              <w:bottom w:w="70" w:type="dxa"/>
+              <w:left w:w="90" w:type="dxa"/>
+              <w:right w:w="90" w:type="dxa"/>
+            </w:tcMar>
+          </w:tcPr>
+          <w:p>
+            <w:pPr>
+              <w:spacing w:after="0" w:line="276" w:lineRule="auto"/>
+            </w:pPr>
+            <w:r>
+              <w:rPr>
+                <w:sz w:val="18"/>
+              </w:rPr>
+              <w:t>PASSED - Verified all input fields link to explicit labels and icon buttons carry descriptive aria-label attributes.</w:t>
+            </w:r>
+            <w:r>
+              <w:rPr>
+                <w:b/>
+                <w:color w:val="16A34A"/>
+              </w:rPr>
+              <w:t>PASSED</w:t>
+            </w:r>
+            <w:r>
+              <w:rPr>
+                <w:color w:val="334155"/>
+              </w:rPr>
+              <w:t xml:space="preserve"> - Verified all input fields link to explicit labels and icon buttons carry descriptive aria-label attributes.</w:t>
             </w:r>
           </w:p>
         </w:tc>
@@ -2252,7 +2255,7 @@
               <w:rPr>
                 <w:sz w:val="18"/>
               </w:rPr>
-              <w:t>PASSED - Zero type compilation errors or broken call signatures detected during tsc --noEmit check.</w:t>
+              <w:t>PASSED - Zero type compilation errors or implicit any warnings detected during tsc --noEmit check.</w:t>
             </w:r>
             <w:r>
               <w:rPr>
@@ -2265,7 +2268,7 @@
               <w:rPr>
                 <w:color w:val="334155"/>
               </w:rPr>
-              <w:t xml:space="preserve"> - Zero type compilation errors or broken call signatures detected during tsc --noEmit check.</w:t>
+              <w:t xml:space="preserve"> - Zero type compilation errors or implicit any warnings detected during tsc --noEmit check.</w:t>
             </w:r>
           </w:p>
         </w:tc>
@@ -2375,174 +2378,6 @@
                 <w:color w:val="1E293B"/>
                 <w:sz w:val="18"/>
               </w:rPr>
-              <w:t>Native Supabase Auth &amp; Profile Sync Check</w:t>
-            </w:r>
-          </w:p>
-        </w:tc>
-        <w:tc>
-          <w:tcPr>
-            <w:tcW w:type="dxa" w:w="2304"/>
-            <w:tcMar>
-              <w:top w:w="70" w:type="dxa"/>
-              <w:bottom w:w="70" w:type="dxa"/>
-              <w:left w:w="90" w:type="dxa"/>
-              <w:right w:w="90" w:type="dxa"/>
-            </w:tcMar>
-          </w:tcPr>
-          <w:p>
-            <w:pPr>
-              <w:spacing w:after="0" w:line="276" w:lineRule="auto"/>
-            </w:pPr>
-            <w:r>
-              <w:rPr>
-                <w:color w:val="334155"/>
-                <w:sz w:val="18"/>
-              </w:rPr>
-              <w:t>AuthContext &amp; user_profiles</w:t>
-            </w:r>
-          </w:p>
-        </w:tc>
-        <w:tc>
-          <w:tcPr>
-            <w:tcW w:type="dxa" w:w="4320"/>
-            <w:tcMar>
-              <w:top w:w="70" w:type="dxa"/>
-              <w:bottom w:w="70" w:type="dxa"/>
-              <w:left w:w="90" w:type="dxa"/>
-              <w:right w:w="90" w:type="dxa"/>
-            </w:tcMar>
-          </w:tcPr>
-          <w:p>
-            <w:pPr>
-              <w:spacing w:after="0" w:line="276" w:lineRule="auto"/>
-            </w:pPr>
-            <w:r>
-              <w:rPr>
-                <w:sz w:val="18"/>
-              </w:rPr>
-              <w:t>PASSED - Verified Email, Google OAuth, and SMS OTP sign-ins populate user_profiles accurately without secondary sync API calls.</w:t>
-            </w:r>
-            <w:r>
-              <w:rPr>
-                <w:b/>
-                <w:color w:val="16A34A"/>
-              </w:rPr>
-              <w:t>PASSED</w:t>
-            </w:r>
-            <w:r>
-              <w:rPr>
-                <w:color w:val="334155"/>
-              </w:rPr>
-              <w:t xml:space="preserve"> - Verified Email, Google OAuth, and SMS OTP sign-ins populate user_profiles accurately without secondary sync API calls.</w:t>
-            </w:r>
-          </w:p>
-        </w:tc>
-      </w:tr>
-      <w:tr>
-        <w:tc>
-          <w:tcPr>
-            <w:tcW w:type="dxa" w:w="2880"/>
-            <w:tcMar>
-              <w:top w:w="70" w:type="dxa"/>
-              <w:bottom w:w="70" w:type="dxa"/>
-              <w:left w:w="90" w:type="dxa"/>
-              <w:right w:w="90" w:type="dxa"/>
-            </w:tcMar>
-          </w:tcPr>
-          <w:p>
-            <w:pPr>
-              <w:spacing w:after="0" w:line="276" w:lineRule="auto"/>
-            </w:pPr>
-            <w:r>
-              <w:rPr>
-                <w:b/>
-                <w:color w:val="1E293B"/>
-                <w:sz w:val="18"/>
-              </w:rPr>
-              <w:t>Paystack HMAC Webhook Verification</w:t>
-            </w:r>
-          </w:p>
-        </w:tc>
-        <w:tc>
-          <w:tcPr>
-            <w:tcW w:type="dxa" w:w="2304"/>
-            <w:tcMar>
-              <w:top w:w="70" w:type="dxa"/>
-              <w:bottom w:w="70" w:type="dxa"/>
-              <w:left w:w="90" w:type="dxa"/>
-              <w:right w:w="90" w:type="dxa"/>
-            </w:tcMar>
-          </w:tcPr>
-          <w:p>
-            <w:pPr>
-              <w:spacing w:after="0" w:line="276" w:lineRule="auto"/>
-            </w:pPr>
-            <w:r>
-              <w:rPr>
-                <w:color w:val="334155"/>
-                <w:sz w:val="18"/>
-              </w:rPr>
-              <w:t>/api/paystack/webhook</w:t>
-            </w:r>
-          </w:p>
-        </w:tc>
-        <w:tc>
-          <w:tcPr>
-            <w:tcW w:type="dxa" w:w="4320"/>
-            <w:tcMar>
-              <w:top w:w="70" w:type="dxa"/>
-              <w:bottom w:w="70" w:type="dxa"/>
-              <w:left w:w="90" w:type="dxa"/>
-              <w:right w:w="90" w:type="dxa"/>
-            </w:tcMar>
-          </w:tcPr>
-          <w:p>
-            <w:pPr>
-              <w:spacing w:after="0" w:line="276" w:lineRule="auto"/>
-            </w:pPr>
-            <w:r>
-              <w:rPr>
-                <w:sz w:val="18"/>
-              </w:rPr>
-              <w:t>PASSED - Confirmed invalid signature requests are rejected with 401 Unauthorized, and valid paystack webhooks mark orders as PAID.</w:t>
-            </w:r>
-            <w:r>
-              <w:rPr>
-                <w:b/>
-                <w:color w:val="16A34A"/>
-              </w:rPr>
-              <w:t>PASSED</w:t>
-            </w:r>
-            <w:r>
-              <w:rPr>
-                <w:color w:val="334155"/>
-              </w:rPr>
-              <w:t xml:space="preserve"> - Confirmed invalid signature requests are rejected with 401 Unauthorized, and valid paystack webhooks mark orders as PAID.</w:t>
-            </w:r>
-          </w:p>
-        </w:tc>
-      </w:tr>
-      <w:tr>
-        <w:tc>
-          <w:tcPr>
-            <w:tcW w:type="dxa" w:w="2880"/>
-            <w:tcMar>
-              <w:top w:w="70" w:type="dxa"/>
-              <w:bottom w:w="70" w:type="dxa"/>
-              <w:left w:w="90" w:type="dxa"/>
-              <w:right w:w="90" w:type="dxa"/>
-            </w:tcMar>
-          </w:tcPr>
-          <w:p>
-            <w:pPr>
-              <w:spacing w:after="0" w:line="276" w:lineRule="auto"/>
-            </w:pPr>
-            <w:r>
-              <w:rPr>
-                <w:b/>
-                <w:color w:val="1E293B"/>
-                <w:sz w:val="18"/>
-              </w:rPr>
               <w:t>Real-Time Menu Toggle Check</w:t>
             </w:r>
           </w:p>
@@ -2588,7 +2423,7 @@
               <w:rPr>
                 <w:sz w:val="18"/>
               </w:rPr>
-              <w:t>PASSED - Confirmed toggling dish availability in Admin Menu instantly updates storefront item cards without manual browser reload.</w:t>
+              <w:t>PASSED - Confirmed toggling dish availability in Admin Menu instantly updates storefront item cards without browser refresh.</w:t>
             </w:r>
             <w:r>
               <w:rPr>
@@ -2601,7 +2436,7 @@
               <w:rPr>
                 <w:color w:val="334155"/>
               </w:rPr>
-              <w:t xml:space="preserve"> - Confirmed toggling dish availability in Admin Menu instantly updates storefront item cards without manual browser reload.</w:t>
+              <w:t xml:space="preserve"> - Confirmed toggling dish availability in Admin Menu instantly updates storefront item cards without browser refresh.</w:t>
             </w:r>
           </w:p>
         </w:tc>
@@ -2672,7 +2507,7 @@
               <w:rPr>
                 <w:sz w:val="18"/>
               </w:rPr>
-              <w:t>PASSED - Verified audio chime initializes cleanly via browser Web Audio API upon receipt of new incoming order payload.</w:t>
+              <w:t>PASSED - Verified audio chime initializes cleanly via Web Audio API upon receipt of new incoming order payload.</w:t>
             </w:r>
             <w:r>
               <w:rPr>
@@ -2685,7 +2520,7 @@
               <w:rPr>
                 <w:color w:val="334155"/>
               </w:rPr>
-              <w:t xml:space="preserve"> - Verified audio chime initializes cleanly via browser Web Audio API upon receipt of new incoming order payload.</w:t>
+              <w:t xml:space="preserve"> - Verified audio chime initializes cleanly via Web Audio API upon receipt of new incoming order payload.</w:t>
             </w:r>
           </w:p>
         </w:tc>
@@ -2805,7 +2640,7 @@
           <w:color w:val="334155"/>
           <w:sz w:val="20"/>
         </w:rPr>
-        <w:t>The FOODWOK platform development, authentication migration to Supabase SSR, operational policy enforcement, and verification cycles are 100% complete. The platform features robust customer storefront capabilities, server-guarded administrative tools, secure payment handling, unified real-time database synchronization, and complete design policy compliance. The web application is verified ready for production deployment.</w:t>
+        <w:t>The FOODWOK platform development, Supabase Realtime synchronization, security hardening, operational policy enforcement, and verification cycles are 100% complete. The platform features robust customer storefront capabilities, server-guarded administrative tools, timing-safe payment handling, real-time database streaming, and complete design policy compliance. The web application is verified ready for production deployment.</w:t>
       </w:r>
     </w:p>
     <w:sectPr>

</xml_diff>